<commit_message>
Rewrite the CodeRabbit why-now beat audience-first
Lead with the engineering-savvy audience and the two people CodeRabbit
serves, the developers who choose it and the leaders who sign, then the
team-operations value line, in plainer conversational language.

Co-Authored-By: Claude Fable 5 <noreply@anthropic.com>
Claude-Session: https://claude.ai/code/session_011Vvxd2V3zerAfjn84yXuuv
</commit_message>
<xml_diff>
--- a/call-scripts/CodeRabbit-F1-Discovery-Call-Script.docx
+++ b/call-scripts/CodeRabbit-F1-Discovery-Call-Script.docx
@@ -1114,46 +1114,85 @@
         <w:ind w:left="280" w:right="120"/>
       </w:pPr>
       <w:r>
-        <w:t xml:space="preserve">I looked at what CodeRabbit is doing. Simple version: AI now writes a huge share of the world's new code. Somebody has to check all that code before it ships. That is you. You built a reviewer that reads every change and catches the problems before they reach customers.</w:t>
-      </w:r>
-    </w:p>
-    <w:p>
-      <w:pPr>
-        <w:pBdr>
-          <w:left w:val="single" w:color="1F3864" w:sz="18"/>
-        </w:pBdr>
-        <w:shd w:fill="F2F4F8" w:val="clear"/>
-        <w:spacing w:after="60" w:before="0" w:line="264"/>
-        <w:ind w:left="280" w:right="120"/>
-      </w:pPr>
-      <w:r>
-        <w:t xml:space="preserve">And developers clearly love it. Yours is the most installed AI app on GitHub. More than eight thousand companies pay for it. And last year you raised sixty million dollars to take it global.</w:t>
-      </w:r>
-    </w:p>
-    <w:p>
-      <w:pPr>
-        <w:pBdr>
-          <w:left w:val="single" w:color="1F3864" w:sz="18"/>
-        </w:pBdr>
-        <w:shd w:fill="F2F4F8" w:val="clear"/>
-        <w:spacing w:after="60" w:before="0" w:line="264"/>
-        <w:ind w:left="280" w:right="120"/>
-      </w:pPr>
-      <w:r>
-        <w:t xml:space="preserve">Now look at this sport in the same period. Atlassian put its name on the Williams team. Oracle's name is on Red Bull. HP's is on Ferrari. Microsoft reportedly signed with Mercedes in January. Software companies are not just sponsoring Formula 1 anymore. They are putting their names on the teams themselves.</w:t>
-      </w:r>
-    </w:p>
-    <w:p>
-      <w:pPr>
-        <w:pBdr>
-          <w:left w:val="single" w:color="1F3864" w:sz="18"/>
-        </w:pBdr>
-        <w:shd w:fill="F2F4F8" w:val="clear"/>
-        <w:spacing w:after="60" w:before="0" w:line="264"/>
-        <w:ind w:left="280" w:right="120"/>
-      </w:pPr>
-      <w:r>
-        <w:t xml:space="preserve">And here is the part most people miss. An F1 team is a software company in disguise. Strategy tools, simulators, trackside systems, and code that must ship perfectly under race-day deadlines. Fast, safe shipping of software is their daily life. So a code review brand fits what these teams do, not just what they wear.</w:t>
+        <w:t xml:space="preserve">I did my homework on CodeRabbit. Simple version: AI now writes a huge share of the world's new code. Somebody has to check that code before it ships. That is you. And developers clearly love the product: yours is the most installed AI app on GitHub, and last year you raised sixty million dollars to go global.</w:t>
+      </w:r>
+    </w:p>
+    <w:p>
+      <w:pPr>
+        <w:pBdr>
+          <w:left w:val="single" w:color="1F3864" w:sz="18"/>
+        </w:pBdr>
+        <w:shd w:fill="F2F4F8" w:val="clear"/>
+        <w:spacing w:after="60" w:before="0" w:line="264"/>
+        <w:ind w:left="280" w:right="120"/>
+      </w:pPr>
+      <w:r>
+        <w:t xml:space="preserve">Now, why Formula 1? For me it comes down to the audience.</w:t>
+      </w:r>
+    </w:p>
+    <w:p>
+      <w:pPr>
+        <w:pBdr>
+          <w:left w:val="single" w:color="1F3864" w:sz="18"/>
+        </w:pBdr>
+        <w:shd w:fill="F2F4F8" w:val="clear"/>
+        <w:spacing w:after="60" w:before="0" w:line="264"/>
+        <w:ind w:left="280" w:right="120"/>
+      </w:pPr>
+      <w:r>
+        <w:t xml:space="preserve">If you look at the Formula 1 audience, they are very engineering savvy and very tech savvy. This sport is won with software, data and simulation, and the fans follow it for exactly that.</w:t>
+      </w:r>
+    </w:p>
+    <w:p>
+      <w:pPr>
+        <w:pBdr>
+          <w:left w:val="single" w:color="1F3864" w:sz="18"/>
+        </w:pBdr>
+        <w:shd w:fill="F2F4F8" w:val="clear"/>
+        <w:spacing w:after="60" w:before="0" w:line="264"/>
+        <w:ind w:left="280" w:right="120"/>
+      </w:pPr>
+      <w:r>
+        <w:t xml:space="preserve">And the way I see it, CodeRabbit serves two people. The developers, who choose the product. And the leaders, who sign the contract. This sport reaches both.</w:t>
+      </w:r>
+    </w:p>
+    <w:p>
+      <w:pPr>
+        <w:pBdr>
+          <w:left w:val="single" w:color="1F3864" w:sz="18"/>
+        </w:pBdr>
+        <w:shd w:fill="F2F4F8" w:val="clear"/>
+        <w:spacing w:after="60" w:before="0" w:line="264"/>
+        <w:ind w:left="280" w:right="120"/>
+      </w:pPr>
+      <w:r>
+        <w:t xml:space="preserve">The leaders: Formula 1 has the highest concentration of business decision makers of any sport, and two thirds of Paddock Club guests are senior executives. For a tech brand, that means CTOs and CIOs.</w:t>
+      </w:r>
+    </w:p>
+    <w:p>
+      <w:pPr>
+        <w:pBdr>
+          <w:left w:val="single" w:color="1F3864" w:sz="18"/>
+        </w:pBdr>
+        <w:shd w:fill="F2F4F8" w:val="clear"/>
+        <w:spacing w:after="60" w:before="0" w:line="264"/>
+        <w:ind w:left="280" w:right="120"/>
+      </w:pPr>
+      <w:r>
+        <w:t xml:space="preserve">The developers: the fans are young and online. 43% are under 35, and no sport gets more engagement on social media.</w:t>
+      </w:r>
+    </w:p>
+    <w:p>
+      <w:pPr>
+        <w:pBdr>
+          <w:left w:val="single" w:color="1F3864" w:sz="18"/>
+        </w:pBdr>
+        <w:shd w:fill="F2F4F8" w:val="clear"/>
+        <w:spacing w:after="60" w:before="0" w:line="264"/>
+        <w:ind w:left="280" w:right="120"/>
+      </w:pPr>
+      <w:r>
+        <w:t xml:space="preserve">And one more thing. An F1 team is itself a software business. Strategy tools, simulators, race software, all shipped under race-day pressure. So what you provide would be of real value to the team itself. Not just a logo on a car. Part of how the team works.</w:t>
       </w:r>
     </w:p>
     <w:p>
@@ -1166,7 +1205,7 @@
         <w:ind w:left="280" w:right="120"/>
       </w:pPr>
       <w:r>
-        <w:t xml:space="preserve">So that is why I called: the timing, and the fit. The brief will tell us the rest."</w:t>
+        <w:t xml:space="preserve">So that is why I called: the audience, and the fit. The brief will tell us the rest."</w:t>
       </w:r>
     </w:p>
     <w:p>

</xml_diff>

<commit_message>
Align the CodeRabbit navigator message with the audience-first beat
Co-Authored-By: Claude Fable 5 <noreply@anthropic.com>
Claude-Session: https://claude.ai/code/session_011Vvxd2V3zerAfjn84yXuuv
</commit_message>
<xml_diff>
--- a/call-scripts/CodeRabbit-F1-Discovery-Call-Script.docx
+++ b/call-scripts/CodeRabbit-F1-Discovery-Call-Script.docx
@@ -343,10 +343,10 @@
           <w:b/>
           <w:bCs/>
         </w:rPr>
-        <w:t xml:space="preserve">Software took over this grid.</w:t>
-      </w:r>
-      <w:r>
-        <w:t xml:space="preserve"> Atlassian's name is on Williams. Oracle's is on Red Bull. HP's is on Ferrari. Microsoft reportedly signed with Mercedes in January. The sport's partner list now looks like your market.</w:t>
+        <w:t xml:space="preserve">This sport reaches both of your audiences.</w:t>
+      </w:r>
+      <w:r>
+        <w:t xml:space="preserve"> The developers who choose the product: young, online, engineering savvy. And the leaders who sign the contract: the highest concentration of business decision makers in sport, with CTOs and CIOs in the Paddock Club.</w:t>
       </w:r>
     </w:p>
     <w:p>

</xml_diff>